<commit_message>
Espaçamento após títulos: linha em branco entre título e texto
</commit_message>
<xml_diff>
--- a/TCC - AKIRA, HENRIQUE, WESLLEY.docx
+++ b/TCC - AKIRA, HENRIQUE, WESLLEY.docx
@@ -1116,7 +1116,13 @@
           <w:tab w:val="right" w:leader="dot" w:pos="9061"/>
         </w:tabs>
         <w:rPr>
+          <w:rFonts w:asciiTheme="minorHAnsi" w:eastAsiaTheme="minorEastAsia" w:hAnsiTheme="minorHAnsi" w:cstheme="minorBidi"/>
           <w:noProof/>
+          <w:color w:val="auto"/>
+          <w:kern w:val="2"/>
+          <w:szCs w:val="24"/>
+          <w:lang w:val="pt-BR" w:eastAsia="pt-BR"/>
+          <w14:ligatures w14:val="standardContextual"/>
         </w:rPr>
       </w:pPr>
       <w:r>
@@ -1128,11 +1134,12 @@
       <w:r>
         <w:fldChar w:fldCharType="separate"/>
       </w:r>
-      <w:hyperlink w:anchor="_Toc225675230" w:history="1">
+      <w:hyperlink w:anchor="_Toc225676160" w:history="1">
         <w:r>
           <w:rPr>
             <w:rStyle w:val="Hyperlink"/>
             <w:noProof/>
+            <w:lang w:val="pt-BR"/>
           </w:rPr>
           <w:t>1 INTRODUÇÃO</w:t>
         </w:r>
@@ -1155,7 +1162,7 @@
             <w:noProof/>
             <w:webHidden/>
           </w:rPr>
-          <w:instrText xml:space="preserve"> PAGEREF _Toc225675230 \h </w:instrText>
+          <w:instrText xml:space="preserve"> PAGEREF _Toc225676160 \h </w:instrText>
         </w:r>
         <w:r>
           <w:rPr>
@@ -1193,14 +1200,21 @@
           <w:tab w:val="right" w:leader="dot" w:pos="9061"/>
         </w:tabs>
         <w:rPr>
+          <w:rFonts w:asciiTheme="minorHAnsi" w:eastAsiaTheme="minorEastAsia" w:hAnsiTheme="minorHAnsi" w:cstheme="minorBidi"/>
           <w:noProof/>
-        </w:rPr>
-      </w:pPr>
-      <w:hyperlink w:anchor="_Toc225675231" w:history="1">
+          <w:color w:val="auto"/>
+          <w:kern w:val="2"/>
+          <w:szCs w:val="24"/>
+          <w:lang w:val="pt-BR" w:eastAsia="pt-BR"/>
+          <w14:ligatures w14:val="standardContextual"/>
+        </w:rPr>
+      </w:pPr>
+      <w:hyperlink w:anchor="_Toc225676161" w:history="1">
         <w:r>
           <w:rPr>
             <w:rStyle w:val="Hyperlink"/>
             <w:noProof/>
+            <w:lang w:val="pt-BR"/>
           </w:rPr>
           <w:t>1.1 OBJETIVOS</w:t>
         </w:r>
@@ -1223,7 +1237,7 @@
             <w:noProof/>
             <w:webHidden/>
           </w:rPr>
-          <w:instrText xml:space="preserve"> PAGEREF _Toc225675231 \h </w:instrText>
+          <w:instrText xml:space="preserve"> PAGEREF _Toc225676161 \h </w:instrText>
         </w:r>
         <w:r>
           <w:rPr>
@@ -1261,14 +1275,21 @@
           <w:tab w:val="right" w:leader="dot" w:pos="9061"/>
         </w:tabs>
         <w:rPr>
+          <w:rFonts w:asciiTheme="minorHAnsi" w:eastAsiaTheme="minorEastAsia" w:hAnsiTheme="minorHAnsi" w:cstheme="minorBidi"/>
           <w:noProof/>
-        </w:rPr>
-      </w:pPr>
-      <w:hyperlink w:anchor="_Toc225675232" w:history="1">
+          <w:color w:val="auto"/>
+          <w:kern w:val="2"/>
+          <w:szCs w:val="24"/>
+          <w:lang w:val="pt-BR" w:eastAsia="pt-BR"/>
+          <w14:ligatures w14:val="standardContextual"/>
+        </w:rPr>
+      </w:pPr>
+      <w:hyperlink w:anchor="_Toc225676162" w:history="1">
         <w:r>
           <w:rPr>
             <w:rStyle w:val="Hyperlink"/>
             <w:noProof/>
+            <w:lang w:val="pt-BR"/>
           </w:rPr>
           <w:t>1.1.1 Objetivo geral</w:t>
         </w:r>
@@ -1291,7 +1312,7 @@
             <w:noProof/>
             <w:webHidden/>
           </w:rPr>
-          <w:instrText xml:space="preserve"> PAGEREF _Toc225675232 \h </w:instrText>
+          <w:instrText xml:space="preserve"> PAGEREF _Toc225676162 \h </w:instrText>
         </w:r>
         <w:r>
           <w:rPr>
@@ -1329,14 +1350,21 @@
           <w:tab w:val="right" w:leader="dot" w:pos="9061"/>
         </w:tabs>
         <w:rPr>
+          <w:rFonts w:asciiTheme="minorHAnsi" w:eastAsiaTheme="minorEastAsia" w:hAnsiTheme="minorHAnsi" w:cstheme="minorBidi"/>
           <w:noProof/>
-        </w:rPr>
-      </w:pPr>
-      <w:hyperlink w:anchor="_Toc225675233" w:history="1">
+          <w:color w:val="auto"/>
+          <w:kern w:val="2"/>
+          <w:szCs w:val="24"/>
+          <w:lang w:val="pt-BR" w:eastAsia="pt-BR"/>
+          <w14:ligatures w14:val="standardContextual"/>
+        </w:rPr>
+      </w:pPr>
+      <w:hyperlink w:anchor="_Toc225676163" w:history="1">
         <w:r>
           <w:rPr>
             <w:rStyle w:val="Hyperlink"/>
             <w:noProof/>
+            <w:lang w:val="pt-BR"/>
           </w:rPr>
           <w:t>1.1.2 Objetivos específicos</w:t>
         </w:r>
@@ -1359,7 +1387,7 @@
             <w:noProof/>
             <w:webHidden/>
           </w:rPr>
-          <w:instrText xml:space="preserve"> PAGEREF _Toc225675233 \h </w:instrText>
+          <w:instrText xml:space="preserve"> PAGEREF _Toc225676163 \h </w:instrText>
         </w:r>
         <w:r>
           <w:rPr>
@@ -1397,14 +1425,21 @@
           <w:tab w:val="right" w:leader="dot" w:pos="9061"/>
         </w:tabs>
         <w:rPr>
+          <w:rFonts w:asciiTheme="minorHAnsi" w:eastAsiaTheme="minorEastAsia" w:hAnsiTheme="minorHAnsi" w:cstheme="minorBidi"/>
           <w:noProof/>
-        </w:rPr>
-      </w:pPr>
-      <w:hyperlink w:anchor="_Toc225675234" w:history="1">
+          <w:color w:val="auto"/>
+          <w:kern w:val="2"/>
+          <w:szCs w:val="24"/>
+          <w:lang w:val="pt-BR" w:eastAsia="pt-BR"/>
+          <w14:ligatures w14:val="standardContextual"/>
+        </w:rPr>
+      </w:pPr>
+      <w:hyperlink w:anchor="_Toc225676164" w:history="1">
         <w:r>
           <w:rPr>
             <w:rStyle w:val="Hyperlink"/>
             <w:noProof/>
+            <w:lang w:val="pt-BR"/>
           </w:rPr>
           <w:t>1.2 DELIMITAÇÃO DO ESTUDO</w:t>
         </w:r>
@@ -1427,7 +1462,7 @@
             <w:noProof/>
             <w:webHidden/>
           </w:rPr>
-          <w:instrText xml:space="preserve"> PAGEREF _Toc225675234 \h </w:instrText>
+          <w:instrText xml:space="preserve"> PAGEREF _Toc225676164 \h </w:instrText>
         </w:r>
         <w:r>
           <w:rPr>
@@ -1465,14 +1500,21 @@
           <w:tab w:val="right" w:leader="dot" w:pos="9061"/>
         </w:tabs>
         <w:rPr>
+          <w:rFonts w:asciiTheme="minorHAnsi" w:eastAsiaTheme="minorEastAsia" w:hAnsiTheme="minorHAnsi" w:cstheme="minorBidi"/>
           <w:noProof/>
-        </w:rPr>
-      </w:pPr>
-      <w:hyperlink w:anchor="_Toc225675235" w:history="1">
+          <w:color w:val="auto"/>
+          <w:kern w:val="2"/>
+          <w:szCs w:val="24"/>
+          <w:lang w:val="pt-BR" w:eastAsia="pt-BR"/>
+          <w14:ligatures w14:val="standardContextual"/>
+        </w:rPr>
+      </w:pPr>
+      <w:hyperlink w:anchor="_Toc225676165" w:history="1">
         <w:r>
           <w:rPr>
             <w:rStyle w:val="Hyperlink"/>
             <w:noProof/>
+            <w:lang w:val="pt-BR"/>
           </w:rPr>
           <w:t>1.3 RELEVÂNCIA DA PESQUISA</w:t>
         </w:r>
@@ -1495,7 +1537,7 @@
             <w:noProof/>
             <w:webHidden/>
           </w:rPr>
-          <w:instrText xml:space="preserve"> PAGEREF _Toc225675235 \h </w:instrText>
+          <w:instrText xml:space="preserve"> PAGEREF _Toc225676165 \h </w:instrText>
         </w:r>
         <w:r>
           <w:rPr>
@@ -1533,14 +1575,21 @@
           <w:tab w:val="right" w:leader="dot" w:pos="9061"/>
         </w:tabs>
         <w:rPr>
+          <w:rFonts w:asciiTheme="minorHAnsi" w:eastAsiaTheme="minorEastAsia" w:hAnsiTheme="minorHAnsi" w:cstheme="minorBidi"/>
           <w:noProof/>
-        </w:rPr>
-      </w:pPr>
-      <w:hyperlink w:anchor="_Toc225675236" w:history="1">
+          <w:color w:val="auto"/>
+          <w:kern w:val="2"/>
+          <w:szCs w:val="24"/>
+          <w:lang w:val="pt-BR" w:eastAsia="pt-BR"/>
+          <w14:ligatures w14:val="standardContextual"/>
+        </w:rPr>
+      </w:pPr>
+      <w:hyperlink w:anchor="_Toc225676166" w:history="1">
         <w:r>
           <w:rPr>
             <w:rStyle w:val="Hyperlink"/>
             <w:noProof/>
+            <w:lang w:val="pt-BR"/>
           </w:rPr>
           <w:t>1.3.1 Alinhamento com os Objetivos de Desenvolvimento Sustentável</w:t>
         </w:r>
@@ -1563,7 +1612,7 @@
             <w:noProof/>
             <w:webHidden/>
           </w:rPr>
-          <w:instrText xml:space="preserve"> PAGEREF _Toc225675236 \h </w:instrText>
+          <w:instrText xml:space="preserve"> PAGEREF _Toc225676166 \h </w:instrText>
         </w:r>
         <w:r>
           <w:rPr>
@@ -1601,14 +1650,21 @@
           <w:tab w:val="right" w:leader="dot" w:pos="9061"/>
         </w:tabs>
         <w:rPr>
+          <w:rFonts w:asciiTheme="minorHAnsi" w:eastAsiaTheme="minorEastAsia" w:hAnsiTheme="minorHAnsi" w:cstheme="minorBidi"/>
           <w:noProof/>
-        </w:rPr>
-      </w:pPr>
-      <w:hyperlink w:anchor="_Toc225675237" w:history="1">
+          <w:color w:val="auto"/>
+          <w:kern w:val="2"/>
+          <w:szCs w:val="24"/>
+          <w:lang w:val="pt-BR" w:eastAsia="pt-BR"/>
+          <w14:ligatures w14:val="standardContextual"/>
+        </w:rPr>
+      </w:pPr>
+      <w:hyperlink w:anchor="_Toc225676167" w:history="1">
         <w:r>
           <w:rPr>
             <w:rStyle w:val="Hyperlink"/>
             <w:noProof/>
+            <w:lang w:val="pt-BR"/>
           </w:rPr>
           <w:t>1.4 METODOLOGIA</w:t>
         </w:r>
@@ -1631,7 +1687,7 @@
             <w:noProof/>
             <w:webHidden/>
           </w:rPr>
-          <w:instrText xml:space="preserve"> PAGEREF _Toc225675237 \h </w:instrText>
+          <w:instrText xml:space="preserve"> PAGEREF _Toc225676167 \h </w:instrText>
         </w:r>
         <w:r>
           <w:rPr>
@@ -1669,14 +1725,21 @@
           <w:tab w:val="right" w:leader="dot" w:pos="9061"/>
         </w:tabs>
         <w:rPr>
+          <w:rFonts w:asciiTheme="minorHAnsi" w:eastAsiaTheme="minorEastAsia" w:hAnsiTheme="minorHAnsi" w:cstheme="minorBidi"/>
           <w:noProof/>
-        </w:rPr>
-      </w:pPr>
-      <w:hyperlink w:anchor="_Toc225675238" w:history="1">
+          <w:color w:val="auto"/>
+          <w:kern w:val="2"/>
+          <w:szCs w:val="24"/>
+          <w:lang w:val="pt-BR" w:eastAsia="pt-BR"/>
+          <w14:ligatures w14:val="standardContextual"/>
+        </w:rPr>
+      </w:pPr>
+      <w:hyperlink w:anchor="_Toc225676168" w:history="1">
         <w:r>
           <w:rPr>
             <w:rStyle w:val="Hyperlink"/>
             <w:noProof/>
+            <w:lang w:val="pt-BR"/>
           </w:rPr>
           <w:t>1.4.1 Classificação da pesquisa</w:t>
         </w:r>
@@ -1699,7 +1762,7 @@
             <w:noProof/>
             <w:webHidden/>
           </w:rPr>
-          <w:instrText xml:space="preserve"> PAGEREF _Toc225675238 \h </w:instrText>
+          <w:instrText xml:space="preserve"> PAGEREF _Toc225676168 \h </w:instrText>
         </w:r>
         <w:r>
           <w:rPr>
@@ -1737,14 +1800,21 @@
           <w:tab w:val="right" w:leader="dot" w:pos="9061"/>
         </w:tabs>
         <w:rPr>
+          <w:rFonts w:asciiTheme="minorHAnsi" w:eastAsiaTheme="minorEastAsia" w:hAnsiTheme="minorHAnsi" w:cstheme="minorBidi"/>
           <w:noProof/>
-        </w:rPr>
-      </w:pPr>
-      <w:hyperlink w:anchor="_Toc225675239" w:history="1">
+          <w:color w:val="auto"/>
+          <w:kern w:val="2"/>
+          <w:szCs w:val="24"/>
+          <w:lang w:val="pt-BR" w:eastAsia="pt-BR"/>
+          <w14:ligatures w14:val="standardContextual"/>
+        </w:rPr>
+      </w:pPr>
+      <w:hyperlink w:anchor="_Toc225676169" w:history="1">
         <w:r>
           <w:rPr>
             <w:rStyle w:val="Hyperlink"/>
             <w:noProof/>
+            <w:lang w:val="pt-BR"/>
           </w:rPr>
           <w:t>1.4.2 Procedimentos de coleta de dados</w:t>
         </w:r>
@@ -1767,7 +1837,7 @@
             <w:noProof/>
             <w:webHidden/>
           </w:rPr>
-          <w:instrText xml:space="preserve"> PAGEREF _Toc225675239 \h </w:instrText>
+          <w:instrText xml:space="preserve"> PAGEREF _Toc225676169 \h </w:instrText>
         </w:r>
         <w:r>
           <w:rPr>
@@ -1805,14 +1875,21 @@
           <w:tab w:val="right" w:leader="dot" w:pos="9061"/>
         </w:tabs>
         <w:rPr>
+          <w:rFonts w:asciiTheme="minorHAnsi" w:eastAsiaTheme="minorEastAsia" w:hAnsiTheme="minorHAnsi" w:cstheme="minorBidi"/>
           <w:noProof/>
-        </w:rPr>
-      </w:pPr>
-      <w:hyperlink w:anchor="_Toc225675240" w:history="1">
+          <w:color w:val="auto"/>
+          <w:kern w:val="2"/>
+          <w:szCs w:val="24"/>
+          <w:lang w:val="pt-BR" w:eastAsia="pt-BR"/>
+          <w14:ligatures w14:val="standardContextual"/>
+        </w:rPr>
+      </w:pPr>
+      <w:hyperlink w:anchor="_Toc225676170" w:history="1">
         <w:r>
           <w:rPr>
             <w:rStyle w:val="Hyperlink"/>
             <w:noProof/>
+            <w:lang w:val="pt-BR"/>
           </w:rPr>
           <w:t>1.4.3 Metodologia de desenvolvimento</w:t>
         </w:r>
@@ -1835,7 +1912,7 @@
             <w:noProof/>
             <w:webHidden/>
           </w:rPr>
-          <w:instrText xml:space="preserve"> PAGEREF _Toc225675240 \h </w:instrText>
+          <w:instrText xml:space="preserve"> PAGEREF _Toc225676170 \h </w:instrText>
         </w:r>
         <w:r>
           <w:rPr>
@@ -1873,14 +1950,21 @@
           <w:tab w:val="right" w:leader="dot" w:pos="9061"/>
         </w:tabs>
         <w:rPr>
+          <w:rFonts w:asciiTheme="minorHAnsi" w:eastAsiaTheme="minorEastAsia" w:hAnsiTheme="minorHAnsi" w:cstheme="minorBidi"/>
           <w:noProof/>
-        </w:rPr>
-      </w:pPr>
-      <w:hyperlink w:anchor="_Toc225675241" w:history="1">
+          <w:color w:val="auto"/>
+          <w:kern w:val="2"/>
+          <w:szCs w:val="24"/>
+          <w:lang w:val="pt-BR" w:eastAsia="pt-BR"/>
+          <w14:ligatures w14:val="standardContextual"/>
+        </w:rPr>
+      </w:pPr>
+      <w:hyperlink w:anchor="_Toc225676171" w:history="1">
         <w:r>
           <w:rPr>
             <w:rStyle w:val="Hyperlink"/>
             <w:noProof/>
+            <w:lang w:val="pt-BR"/>
           </w:rPr>
           <w:t>1.4.4 Materiais e ferramentas</w:t>
         </w:r>
@@ -1903,7 +1987,7 @@
             <w:noProof/>
             <w:webHidden/>
           </w:rPr>
-          <w:instrText xml:space="preserve"> PAGEREF _Toc225675241 \h </w:instrText>
+          <w:instrText xml:space="preserve"> PAGEREF _Toc225676171 \h </w:instrText>
         </w:r>
         <w:r>
           <w:rPr>
@@ -1941,14 +2025,21 @@
           <w:tab w:val="right" w:leader="dot" w:pos="9061"/>
         </w:tabs>
         <w:rPr>
+          <w:rFonts w:asciiTheme="minorHAnsi" w:eastAsiaTheme="minorEastAsia" w:hAnsiTheme="minorHAnsi" w:cstheme="minorBidi"/>
           <w:noProof/>
-        </w:rPr>
-      </w:pPr>
-      <w:hyperlink w:anchor="_Toc225675242" w:history="1">
+          <w:color w:val="auto"/>
+          <w:kern w:val="2"/>
+          <w:szCs w:val="24"/>
+          <w:lang w:val="pt-BR" w:eastAsia="pt-BR"/>
+          <w14:ligatures w14:val="standardContextual"/>
+        </w:rPr>
+      </w:pPr>
+      <w:hyperlink w:anchor="_Toc225676172" w:history="1">
         <w:r>
           <w:rPr>
             <w:rStyle w:val="Hyperlink"/>
             <w:noProof/>
+            <w:lang w:val="pt-BR"/>
           </w:rPr>
           <w:t>1.4.5 Procedimentos de teste e validação</w:t>
         </w:r>
@@ -1971,7 +2062,7 @@
             <w:noProof/>
             <w:webHidden/>
           </w:rPr>
-          <w:instrText xml:space="preserve"> PAGEREF _Toc225675242 \h </w:instrText>
+          <w:instrText xml:space="preserve"> PAGEREF _Toc225676172 \h </w:instrText>
         </w:r>
         <w:r>
           <w:rPr>
@@ -2009,14 +2100,21 @@
           <w:tab w:val="right" w:leader="dot" w:pos="9061"/>
         </w:tabs>
         <w:rPr>
+          <w:rFonts w:asciiTheme="minorHAnsi" w:eastAsiaTheme="minorEastAsia" w:hAnsiTheme="minorHAnsi" w:cstheme="minorBidi"/>
           <w:noProof/>
-        </w:rPr>
-      </w:pPr>
-      <w:hyperlink w:anchor="_Toc225675243" w:history="1">
+          <w:color w:val="auto"/>
+          <w:kern w:val="2"/>
+          <w:szCs w:val="24"/>
+          <w:lang w:val="pt-BR" w:eastAsia="pt-BR"/>
+          <w14:ligatures w14:val="standardContextual"/>
+        </w:rPr>
+      </w:pPr>
+      <w:hyperlink w:anchor="_Toc225676173" w:history="1">
         <w:r>
           <w:rPr>
             <w:rStyle w:val="Hyperlink"/>
             <w:noProof/>
+            <w:lang w:val="pt-BR"/>
           </w:rPr>
           <w:t>1.5 ESTRUTURA DA DOCUMENTAÇÃO TÉCNICA</w:t>
         </w:r>
@@ -2039,7 +2137,7 @@
             <w:noProof/>
             <w:webHidden/>
           </w:rPr>
-          <w:instrText xml:space="preserve"> PAGEREF _Toc225675243 \h </w:instrText>
+          <w:instrText xml:space="preserve"> PAGEREF _Toc225676173 \h </w:instrText>
         </w:r>
         <w:r>
           <w:rPr>
@@ -2077,14 +2175,21 @@
           <w:tab w:val="right" w:leader="dot" w:pos="9061"/>
         </w:tabs>
         <w:rPr>
+          <w:rFonts w:asciiTheme="minorHAnsi" w:eastAsiaTheme="minorEastAsia" w:hAnsiTheme="minorHAnsi" w:cstheme="minorBidi"/>
           <w:noProof/>
-        </w:rPr>
-      </w:pPr>
-      <w:hyperlink w:anchor="_Toc225675244" w:history="1">
+          <w:color w:val="auto"/>
+          <w:kern w:val="2"/>
+          <w:szCs w:val="24"/>
+          <w:lang w:val="pt-BR" w:eastAsia="pt-BR"/>
+          <w14:ligatures w14:val="standardContextual"/>
+        </w:rPr>
+      </w:pPr>
+      <w:hyperlink w:anchor="_Toc225676174" w:history="1">
         <w:r>
           <w:rPr>
             <w:rStyle w:val="Hyperlink"/>
             <w:noProof/>
+            <w:lang w:val="pt-BR"/>
           </w:rPr>
           <w:t>1.6 CRONOGRAMA</w:t>
         </w:r>
@@ -2107,7 +2212,7 @@
             <w:noProof/>
             <w:webHidden/>
           </w:rPr>
-          <w:instrText xml:space="preserve"> PAGEREF _Toc225675244 \h </w:instrText>
+          <w:instrText xml:space="preserve"> PAGEREF _Toc225676174 \h </w:instrText>
         </w:r>
         <w:r>
           <w:rPr>
@@ -2145,14 +2250,21 @@
           <w:tab w:val="right" w:leader="dot" w:pos="9061"/>
         </w:tabs>
         <w:rPr>
+          <w:rFonts w:asciiTheme="minorHAnsi" w:eastAsiaTheme="minorEastAsia" w:hAnsiTheme="minorHAnsi" w:cstheme="minorBidi"/>
           <w:noProof/>
-        </w:rPr>
-      </w:pPr>
-      <w:hyperlink w:anchor="_Toc225675245" w:history="1">
+          <w:color w:val="auto"/>
+          <w:kern w:val="2"/>
+          <w:szCs w:val="24"/>
+          <w:lang w:val="pt-BR" w:eastAsia="pt-BR"/>
+          <w14:ligatures w14:val="standardContextual"/>
+        </w:rPr>
+      </w:pPr>
+      <w:hyperlink w:anchor="_Toc225676175" w:history="1">
         <w:r>
           <w:rPr>
             <w:rStyle w:val="Hyperlink"/>
             <w:noProof/>
+            <w:lang w:val="pt-BR"/>
           </w:rPr>
           <w:t>1.7 ORÇAMENTO DO PROJETO</w:t>
         </w:r>
@@ -2175,7 +2287,7 @@
             <w:noProof/>
             <w:webHidden/>
           </w:rPr>
-          <w:instrText xml:space="preserve"> PAGEREF _Toc225675245 \h </w:instrText>
+          <w:instrText xml:space="preserve"> PAGEREF _Toc225676175 \h </w:instrText>
         </w:r>
         <w:r>
           <w:rPr>
@@ -2213,14 +2325,21 @@
           <w:tab w:val="right" w:leader="dot" w:pos="9061"/>
         </w:tabs>
         <w:rPr>
+          <w:rFonts w:asciiTheme="minorHAnsi" w:eastAsiaTheme="minorEastAsia" w:hAnsiTheme="minorHAnsi" w:cstheme="minorBidi"/>
           <w:noProof/>
-        </w:rPr>
-      </w:pPr>
-      <w:hyperlink w:anchor="_Toc225675246" w:history="1">
+          <w:color w:val="auto"/>
+          <w:kern w:val="2"/>
+          <w:szCs w:val="24"/>
+          <w:lang w:val="pt-BR" w:eastAsia="pt-BR"/>
+          <w14:ligatures w14:val="standardContextual"/>
+        </w:rPr>
+      </w:pPr>
+      <w:hyperlink w:anchor="_Toc225676176" w:history="1">
         <w:r>
           <w:rPr>
             <w:rStyle w:val="Hyperlink"/>
             <w:noProof/>
+            <w:lang w:val="pt-BR"/>
           </w:rPr>
           <w:t>2 REFERENCIAL TEÓRICO</w:t>
         </w:r>
@@ -2243,7 +2362,7 @@
             <w:noProof/>
             <w:webHidden/>
           </w:rPr>
-          <w:instrText xml:space="preserve"> PAGEREF _Toc225675246 \h </w:instrText>
+          <w:instrText xml:space="preserve"> PAGEREF _Toc225676176 \h </w:instrText>
         </w:r>
         <w:r>
           <w:rPr>
@@ -2281,14 +2400,21 @@
           <w:tab w:val="right" w:leader="dot" w:pos="9061"/>
         </w:tabs>
         <w:rPr>
+          <w:rFonts w:asciiTheme="minorHAnsi" w:eastAsiaTheme="minorEastAsia" w:hAnsiTheme="minorHAnsi" w:cstheme="minorBidi"/>
           <w:noProof/>
-        </w:rPr>
-      </w:pPr>
-      <w:hyperlink w:anchor="_Toc225675247" w:history="1">
+          <w:color w:val="auto"/>
+          <w:kern w:val="2"/>
+          <w:szCs w:val="24"/>
+          <w:lang w:val="pt-BR" w:eastAsia="pt-BR"/>
+          <w14:ligatures w14:val="standardContextual"/>
+        </w:rPr>
+      </w:pPr>
+      <w:hyperlink w:anchor="_Toc225676177" w:history="1">
         <w:r>
           <w:rPr>
             <w:rStyle w:val="Hyperlink"/>
             <w:noProof/>
+            <w:lang w:val="pt-BR"/>
           </w:rPr>
           <w:t>2.1 O PROBLEMA DA GESTÃO MANUAL DE ESPAÇOS EM ORGANIZAÇÕES</w:t>
         </w:r>
@@ -2311,7 +2437,7 @@
             <w:noProof/>
             <w:webHidden/>
           </w:rPr>
-          <w:instrText xml:space="preserve"> PAGEREF _Toc225675247 \h </w:instrText>
+          <w:instrText xml:space="preserve"> PAGEREF _Toc225676177 \h </w:instrText>
         </w:r>
         <w:r>
           <w:rPr>
@@ -2349,14 +2475,21 @@
           <w:tab w:val="right" w:leader="dot" w:pos="9061"/>
         </w:tabs>
         <w:rPr>
+          <w:rFonts w:asciiTheme="minorHAnsi" w:eastAsiaTheme="minorEastAsia" w:hAnsiTheme="minorHAnsi" w:cstheme="minorBidi"/>
           <w:noProof/>
-        </w:rPr>
-      </w:pPr>
-      <w:hyperlink w:anchor="_Toc225675248" w:history="1">
+          <w:color w:val="auto"/>
+          <w:kern w:val="2"/>
+          <w:szCs w:val="24"/>
+          <w:lang w:val="pt-BR" w:eastAsia="pt-BR"/>
+          <w14:ligatures w14:val="standardContextual"/>
+        </w:rPr>
+      </w:pPr>
+      <w:hyperlink w:anchor="_Toc225676178" w:history="1">
         <w:r>
           <w:rPr>
             <w:rStyle w:val="Hyperlink"/>
             <w:noProof/>
+            <w:lang w:val="pt-BR"/>
           </w:rPr>
           <w:t>2.2 COMUNIDADES AFETADAS E SEUS IMPACTOS</w:t>
         </w:r>
@@ -2379,7 +2512,7 @@
             <w:noProof/>
             <w:webHidden/>
           </w:rPr>
-          <w:instrText xml:space="preserve"> PAGEREF _Toc225675248 \h </w:instrText>
+          <w:instrText xml:space="preserve"> PAGEREF _Toc225676178 \h </w:instrText>
         </w:r>
         <w:r>
           <w:rPr>
@@ -2417,14 +2550,21 @@
           <w:tab w:val="right" w:leader="dot" w:pos="9061"/>
         </w:tabs>
         <w:rPr>
+          <w:rFonts w:asciiTheme="minorHAnsi" w:eastAsiaTheme="minorEastAsia" w:hAnsiTheme="minorHAnsi" w:cstheme="minorBidi"/>
           <w:noProof/>
-        </w:rPr>
-      </w:pPr>
-      <w:hyperlink w:anchor="_Toc225675249" w:history="1">
+          <w:color w:val="auto"/>
+          <w:kern w:val="2"/>
+          <w:szCs w:val="24"/>
+          <w:lang w:val="pt-BR" w:eastAsia="pt-BR"/>
+          <w14:ligatures w14:val="standardContextual"/>
+        </w:rPr>
+      </w:pPr>
+      <w:hyperlink w:anchor="_Toc225676179" w:history="1">
         <w:r>
           <w:rPr>
             <w:rStyle w:val="Hyperlink"/>
             <w:noProof/>
+            <w:lang w:val="pt-BR"/>
           </w:rPr>
           <w:t>2.3 OBJETIVOS DE DESENVOLVIMENTO SUSTENTÁVEL (ODS)</w:t>
         </w:r>
@@ -2447,7 +2587,7 @@
             <w:noProof/>
             <w:webHidden/>
           </w:rPr>
-          <w:instrText xml:space="preserve"> PAGEREF _Toc225675249 \h </w:instrText>
+          <w:instrText xml:space="preserve"> PAGEREF _Toc225676179 \h </w:instrText>
         </w:r>
         <w:r>
           <w:rPr>
@@ -2485,14 +2625,21 @@
           <w:tab w:val="right" w:leader="dot" w:pos="9061"/>
         </w:tabs>
         <w:rPr>
+          <w:rFonts w:asciiTheme="minorHAnsi" w:eastAsiaTheme="minorEastAsia" w:hAnsiTheme="minorHAnsi" w:cstheme="minorBidi"/>
           <w:noProof/>
-        </w:rPr>
-      </w:pPr>
-      <w:hyperlink w:anchor="_Toc225675250" w:history="1">
+          <w:color w:val="auto"/>
+          <w:kern w:val="2"/>
+          <w:szCs w:val="24"/>
+          <w:lang w:val="pt-BR" w:eastAsia="pt-BR"/>
+          <w14:ligatures w14:val="standardContextual"/>
+        </w:rPr>
+      </w:pPr>
+      <w:hyperlink w:anchor="_Toc225676180" w:history="1">
         <w:r>
           <w:rPr>
             <w:rStyle w:val="Hyperlink"/>
             <w:noProof/>
+            <w:lang w:val="pt-BR"/>
           </w:rPr>
           <w:t>2.4 TRANSFORMAÇÃO DIGITAL E SISTEMAS DE AGENDAMENTO</w:t>
         </w:r>
@@ -2515,7 +2662,7 @@
             <w:noProof/>
             <w:webHidden/>
           </w:rPr>
-          <w:instrText xml:space="preserve"> PAGEREF _Toc225675250 \h </w:instrText>
+          <w:instrText xml:space="preserve"> PAGEREF _Toc225676180 \h </w:instrText>
         </w:r>
         <w:r>
           <w:rPr>
@@ -2553,14 +2700,21 @@
           <w:tab w:val="right" w:leader="dot" w:pos="9061"/>
         </w:tabs>
         <w:rPr>
+          <w:rFonts w:asciiTheme="minorHAnsi" w:eastAsiaTheme="minorEastAsia" w:hAnsiTheme="minorHAnsi" w:cstheme="minorBidi"/>
           <w:noProof/>
-        </w:rPr>
-      </w:pPr>
-      <w:hyperlink w:anchor="_Toc225675251" w:history="1">
+          <w:color w:val="auto"/>
+          <w:kern w:val="2"/>
+          <w:szCs w:val="24"/>
+          <w:lang w:val="pt-BR" w:eastAsia="pt-BR"/>
+          <w14:ligatures w14:val="standardContextual"/>
+        </w:rPr>
+      </w:pPr>
+      <w:hyperlink w:anchor="_Toc225676181" w:history="1">
         <w:r>
           <w:rPr>
             <w:rStyle w:val="Hyperlink"/>
             <w:noProof/>
+            <w:lang w:val="pt-BR"/>
           </w:rPr>
           <w:t>2.5 TECNOLOGIAS WEB PARA DESENVOLVIMENTO DA SOLUÇÃO</w:t>
         </w:r>
@@ -2583,7 +2737,7 @@
             <w:noProof/>
             <w:webHidden/>
           </w:rPr>
-          <w:instrText xml:space="preserve"> PAGEREF _Toc225675251 \h </w:instrText>
+          <w:instrText xml:space="preserve"> PAGEREF _Toc225676181 \h </w:instrText>
         </w:r>
         <w:r>
           <w:rPr>
@@ -2621,14 +2775,21 @@
           <w:tab w:val="right" w:leader="dot" w:pos="9061"/>
         </w:tabs>
         <w:rPr>
+          <w:rFonts w:asciiTheme="minorHAnsi" w:eastAsiaTheme="minorEastAsia" w:hAnsiTheme="minorHAnsi" w:cstheme="minorBidi"/>
           <w:noProof/>
-        </w:rPr>
-      </w:pPr>
-      <w:hyperlink w:anchor="_Toc225675252" w:history="1">
+          <w:color w:val="auto"/>
+          <w:kern w:val="2"/>
+          <w:szCs w:val="24"/>
+          <w:lang w:val="pt-BR" w:eastAsia="pt-BR"/>
+          <w14:ligatures w14:val="standardContextual"/>
+        </w:rPr>
+      </w:pPr>
+      <w:hyperlink w:anchor="_Toc225676182" w:history="1">
         <w:r>
           <w:rPr>
             <w:rStyle w:val="Hyperlink"/>
             <w:noProof/>
+            <w:lang w:val="pt-BR"/>
           </w:rPr>
           <w:t>3 PROPOSTA DA APLICAÇÃO</w:t>
         </w:r>
@@ -2651,7 +2812,7 @@
             <w:noProof/>
             <w:webHidden/>
           </w:rPr>
-          <w:instrText xml:space="preserve"> PAGEREF _Toc225675252 \h </w:instrText>
+          <w:instrText xml:space="preserve"> PAGEREF _Toc225676182 \h </w:instrText>
         </w:r>
         <w:r>
           <w:rPr>
@@ -2689,14 +2850,21 @@
           <w:tab w:val="right" w:leader="dot" w:pos="9061"/>
         </w:tabs>
         <w:rPr>
+          <w:rFonts w:asciiTheme="minorHAnsi" w:eastAsiaTheme="minorEastAsia" w:hAnsiTheme="minorHAnsi" w:cstheme="minorBidi"/>
           <w:noProof/>
-        </w:rPr>
-      </w:pPr>
-      <w:hyperlink w:anchor="_Toc225675253" w:history="1">
+          <w:color w:val="auto"/>
+          <w:kern w:val="2"/>
+          <w:szCs w:val="24"/>
+          <w:lang w:val="pt-BR" w:eastAsia="pt-BR"/>
+          <w14:ligatures w14:val="standardContextual"/>
+        </w:rPr>
+      </w:pPr>
+      <w:hyperlink w:anchor="_Toc225676183" w:history="1">
         <w:r>
           <w:rPr>
             <w:rStyle w:val="Hyperlink"/>
             <w:noProof/>
+            <w:lang w:val="pt-BR"/>
           </w:rPr>
           <w:t>3.1 DESCRIÇÃO DA APLICAÇÃO</w:t>
         </w:r>
@@ -2719,7 +2887,7 @@
             <w:noProof/>
             <w:webHidden/>
           </w:rPr>
-          <w:instrText xml:space="preserve"> PAGEREF _Toc225675253 \h </w:instrText>
+          <w:instrText xml:space="preserve"> PAGEREF _Toc225676183 \h </w:instrText>
         </w:r>
         <w:r>
           <w:rPr>
@@ -2757,14 +2925,21 @@
           <w:tab w:val="right" w:leader="dot" w:pos="9061"/>
         </w:tabs>
         <w:rPr>
+          <w:rFonts w:asciiTheme="minorHAnsi" w:eastAsiaTheme="minorEastAsia" w:hAnsiTheme="minorHAnsi" w:cstheme="minorBidi"/>
           <w:noProof/>
-        </w:rPr>
-      </w:pPr>
-      <w:hyperlink w:anchor="_Toc225675254" w:history="1">
+          <w:color w:val="auto"/>
+          <w:kern w:val="2"/>
+          <w:szCs w:val="24"/>
+          <w:lang w:val="pt-BR" w:eastAsia="pt-BR"/>
+          <w14:ligatures w14:val="standardContextual"/>
+        </w:rPr>
+      </w:pPr>
+      <w:hyperlink w:anchor="_Toc225676184" w:history="1">
         <w:r>
           <w:rPr>
             <w:rStyle w:val="Hyperlink"/>
             <w:noProof/>
+            <w:lang w:val="pt-BR"/>
           </w:rPr>
           <w:t>3.2 MODELAGEM DOS REQUISITOS</w:t>
         </w:r>
@@ -2787,7 +2962,7 @@
             <w:noProof/>
             <w:webHidden/>
           </w:rPr>
-          <w:instrText xml:space="preserve"> PAGEREF _Toc225675254 \h </w:instrText>
+          <w:instrText xml:space="preserve"> PAGEREF _Toc225676184 \h </w:instrText>
         </w:r>
         <w:r>
           <w:rPr>
@@ -2825,14 +3000,21 @@
           <w:tab w:val="right" w:leader="dot" w:pos="9061"/>
         </w:tabs>
         <w:rPr>
+          <w:rFonts w:asciiTheme="minorHAnsi" w:eastAsiaTheme="minorEastAsia" w:hAnsiTheme="minorHAnsi" w:cstheme="minorBidi"/>
           <w:noProof/>
-        </w:rPr>
-      </w:pPr>
-      <w:hyperlink w:anchor="_Toc225675255" w:history="1">
+          <w:color w:val="auto"/>
+          <w:kern w:val="2"/>
+          <w:szCs w:val="24"/>
+          <w:lang w:val="pt-BR" w:eastAsia="pt-BR"/>
+          <w14:ligatures w14:val="standardContextual"/>
+        </w:rPr>
+      </w:pPr>
+      <w:hyperlink w:anchor="_Toc225676185" w:history="1">
         <w:r>
           <w:rPr>
             <w:rStyle w:val="Hyperlink"/>
             <w:noProof/>
+            <w:lang w:val="pt-BR"/>
           </w:rPr>
           <w:t>3.2.1 Requisitos funcionais</w:t>
         </w:r>
@@ -2855,7 +3037,7 @@
             <w:noProof/>
             <w:webHidden/>
           </w:rPr>
-          <w:instrText xml:space="preserve"> PAGEREF _Toc225675255 \h </w:instrText>
+          <w:instrText xml:space="preserve"> PAGEREF _Toc225676185 \h </w:instrText>
         </w:r>
         <w:r>
           <w:rPr>
@@ -2893,14 +3075,21 @@
           <w:tab w:val="right" w:leader="dot" w:pos="9061"/>
         </w:tabs>
         <w:rPr>
+          <w:rFonts w:asciiTheme="minorHAnsi" w:eastAsiaTheme="minorEastAsia" w:hAnsiTheme="minorHAnsi" w:cstheme="minorBidi"/>
           <w:noProof/>
-        </w:rPr>
-      </w:pPr>
-      <w:hyperlink w:anchor="_Toc225675256" w:history="1">
+          <w:color w:val="auto"/>
+          <w:kern w:val="2"/>
+          <w:szCs w:val="24"/>
+          <w:lang w:val="pt-BR" w:eastAsia="pt-BR"/>
+          <w14:ligatures w14:val="standardContextual"/>
+        </w:rPr>
+      </w:pPr>
+      <w:hyperlink w:anchor="_Toc225676186" w:history="1">
         <w:r>
           <w:rPr>
             <w:rStyle w:val="Hyperlink"/>
             <w:noProof/>
+            <w:lang w:val="pt-BR"/>
           </w:rPr>
           <w:t>3.2.2 Requisitos não funcionais</w:t>
         </w:r>
@@ -2923,7 +3112,7 @@
             <w:noProof/>
             <w:webHidden/>
           </w:rPr>
-          <w:instrText xml:space="preserve"> PAGEREF _Toc225675256 \h </w:instrText>
+          <w:instrText xml:space="preserve"> PAGEREF _Toc225676186 \h </w:instrText>
         </w:r>
         <w:r>
           <w:rPr>
@@ -2961,14 +3150,21 @@
           <w:tab w:val="right" w:leader="dot" w:pos="9061"/>
         </w:tabs>
         <w:rPr>
+          <w:rFonts w:asciiTheme="minorHAnsi" w:eastAsiaTheme="minorEastAsia" w:hAnsiTheme="minorHAnsi" w:cstheme="minorBidi"/>
           <w:noProof/>
-        </w:rPr>
-      </w:pPr>
-      <w:hyperlink w:anchor="_Toc225675257" w:history="1">
+          <w:color w:val="auto"/>
+          <w:kern w:val="2"/>
+          <w:szCs w:val="24"/>
+          <w:lang w:val="pt-BR" w:eastAsia="pt-BR"/>
+          <w14:ligatures w14:val="standardContextual"/>
+        </w:rPr>
+      </w:pPr>
+      <w:hyperlink w:anchor="_Toc225676187" w:history="1">
         <w:r>
           <w:rPr>
             <w:rStyle w:val="Hyperlink"/>
             <w:noProof/>
+            <w:lang w:val="pt-BR"/>
           </w:rPr>
           <w:t>3.3 CASOS DE USO</w:t>
         </w:r>
@@ -2991,7 +3187,7 @@
             <w:noProof/>
             <w:webHidden/>
           </w:rPr>
-          <w:instrText xml:space="preserve"> PAGEREF _Toc225675257 \h </w:instrText>
+          <w:instrText xml:space="preserve"> PAGEREF _Toc225676187 \h </w:instrText>
         </w:r>
         <w:r>
           <w:rPr>
@@ -3029,14 +3225,21 @@
           <w:tab w:val="right" w:leader="dot" w:pos="9061"/>
         </w:tabs>
         <w:rPr>
+          <w:rFonts w:asciiTheme="minorHAnsi" w:eastAsiaTheme="minorEastAsia" w:hAnsiTheme="minorHAnsi" w:cstheme="minorBidi"/>
           <w:noProof/>
-        </w:rPr>
-      </w:pPr>
-      <w:hyperlink w:anchor="_Toc225675258" w:history="1">
+          <w:color w:val="auto"/>
+          <w:kern w:val="2"/>
+          <w:szCs w:val="24"/>
+          <w:lang w:val="pt-BR" w:eastAsia="pt-BR"/>
+          <w14:ligatures w14:val="standardContextual"/>
+        </w:rPr>
+      </w:pPr>
+      <w:hyperlink w:anchor="_Toc225676188" w:history="1">
         <w:r>
           <w:rPr>
             <w:rStyle w:val="Hyperlink"/>
             <w:noProof/>
+            <w:lang w:val="pt-BR"/>
           </w:rPr>
           <w:t>3.3.1 Diagrama de caso de uso</w:t>
         </w:r>
@@ -3059,7 +3262,7 @@
             <w:noProof/>
             <w:webHidden/>
           </w:rPr>
-          <w:instrText xml:space="preserve"> PAGEREF _Toc225675258 \h </w:instrText>
+          <w:instrText xml:space="preserve"> PAGEREF _Toc225676188 \h </w:instrText>
         </w:r>
         <w:r>
           <w:rPr>
@@ -3097,14 +3300,21 @@
           <w:tab w:val="right" w:leader="dot" w:pos="9061"/>
         </w:tabs>
         <w:rPr>
+          <w:rFonts w:asciiTheme="minorHAnsi" w:eastAsiaTheme="minorEastAsia" w:hAnsiTheme="minorHAnsi" w:cstheme="minorBidi"/>
           <w:noProof/>
-        </w:rPr>
-      </w:pPr>
-      <w:hyperlink w:anchor="_Toc225675259" w:history="1">
+          <w:color w:val="auto"/>
+          <w:kern w:val="2"/>
+          <w:szCs w:val="24"/>
+          <w:lang w:val="pt-BR" w:eastAsia="pt-BR"/>
+          <w14:ligatures w14:val="standardContextual"/>
+        </w:rPr>
+      </w:pPr>
+      <w:hyperlink w:anchor="_Toc225676189" w:history="1">
         <w:r>
           <w:rPr>
             <w:rStyle w:val="Hyperlink"/>
             <w:noProof/>
+            <w:lang w:val="pt-BR"/>
           </w:rPr>
           <w:t>3.4 DIAGRAMAS DE CLASSES</w:t>
         </w:r>
@@ -3127,7 +3337,7 @@
             <w:noProof/>
             <w:webHidden/>
           </w:rPr>
-          <w:instrText xml:space="preserve"> PAGEREF _Toc225675259 \h </w:instrText>
+          <w:instrText xml:space="preserve"> PAGEREF _Toc225676189 \h </w:instrText>
         </w:r>
         <w:r>
           <w:rPr>
@@ -3165,14 +3375,21 @@
           <w:tab w:val="right" w:leader="dot" w:pos="9061"/>
         </w:tabs>
         <w:rPr>
+          <w:rFonts w:asciiTheme="minorHAnsi" w:eastAsiaTheme="minorEastAsia" w:hAnsiTheme="minorHAnsi" w:cstheme="minorBidi"/>
           <w:noProof/>
-        </w:rPr>
-      </w:pPr>
-      <w:hyperlink w:anchor="_Toc225675260" w:history="1">
+          <w:color w:val="auto"/>
+          <w:kern w:val="2"/>
+          <w:szCs w:val="24"/>
+          <w:lang w:val="pt-BR" w:eastAsia="pt-BR"/>
+          <w14:ligatures w14:val="standardContextual"/>
+        </w:rPr>
+      </w:pPr>
+      <w:hyperlink w:anchor="_Toc225676190" w:history="1">
         <w:r>
           <w:rPr>
             <w:rStyle w:val="Hyperlink"/>
             <w:noProof/>
+            <w:lang w:val="pt-BR"/>
           </w:rPr>
           <w:t>3.5 REGRAS DE NEGÓCIO</w:t>
         </w:r>
@@ -3195,7 +3412,7 @@
             <w:noProof/>
             <w:webHidden/>
           </w:rPr>
-          <w:instrText xml:space="preserve"> PAGEREF _Toc225675260 \h </w:instrText>
+          <w:instrText xml:space="preserve"> PAGEREF _Toc225676190 \h </w:instrText>
         </w:r>
         <w:r>
           <w:rPr>
@@ -3233,14 +3450,21 @@
           <w:tab w:val="right" w:leader="dot" w:pos="9061"/>
         </w:tabs>
         <w:rPr>
+          <w:rFonts w:asciiTheme="minorHAnsi" w:eastAsiaTheme="minorEastAsia" w:hAnsiTheme="minorHAnsi" w:cstheme="minorBidi"/>
           <w:noProof/>
-        </w:rPr>
-      </w:pPr>
-      <w:hyperlink w:anchor="_Toc225675261" w:history="1">
+          <w:color w:val="auto"/>
+          <w:kern w:val="2"/>
+          <w:szCs w:val="24"/>
+          <w:lang w:val="pt-BR" w:eastAsia="pt-BR"/>
+          <w14:ligatures w14:val="standardContextual"/>
+        </w:rPr>
+      </w:pPr>
+      <w:hyperlink w:anchor="_Toc225676191" w:history="1">
         <w:r>
           <w:rPr>
             <w:rStyle w:val="Hyperlink"/>
             <w:noProof/>
+            <w:lang w:val="pt-BR"/>
           </w:rPr>
           <w:t>3.6 PROTÓTIPO DA APLICAÇÃO (</w:t>
         </w:r>
@@ -3249,6 +3473,7 @@
             <w:rStyle w:val="Hyperlink"/>
             <w:i/>
             <w:noProof/>
+            <w:lang w:val="pt-BR"/>
           </w:rPr>
           <w:t>WIREFRAME</w:t>
         </w:r>
@@ -3256,6 +3481,7 @@
           <w:rPr>
             <w:rStyle w:val="Hyperlink"/>
             <w:noProof/>
+            <w:lang w:val="pt-BR"/>
           </w:rPr>
           <w:t>)</w:t>
         </w:r>
@@ -3278,7 +3504,7 @@
             <w:noProof/>
             <w:webHidden/>
           </w:rPr>
-          <w:instrText xml:space="preserve"> PAGEREF _Toc225675261 \h </w:instrText>
+          <w:instrText xml:space="preserve"> PAGEREF _Toc225676191 \h </w:instrText>
         </w:r>
         <w:r>
           <w:rPr>
@@ -3316,14 +3542,21 @@
           <w:tab w:val="right" w:leader="dot" w:pos="9061"/>
         </w:tabs>
         <w:rPr>
+          <w:rFonts w:asciiTheme="minorHAnsi" w:eastAsiaTheme="minorEastAsia" w:hAnsiTheme="minorHAnsi" w:cstheme="minorBidi"/>
           <w:noProof/>
-        </w:rPr>
-      </w:pPr>
-      <w:hyperlink w:anchor="_Toc225675262" w:history="1">
+          <w:color w:val="auto"/>
+          <w:kern w:val="2"/>
+          <w:szCs w:val="24"/>
+          <w:lang w:val="pt-BR" w:eastAsia="pt-BR"/>
+          <w14:ligatures w14:val="standardContextual"/>
+        </w:rPr>
+      </w:pPr>
+      <w:hyperlink w:anchor="_Toc225676192" w:history="1">
         <w:r>
           <w:rPr>
             <w:rStyle w:val="Hyperlink"/>
             <w:noProof/>
+            <w:lang w:val="pt-BR"/>
           </w:rPr>
           <w:t>3.7 MODELAGEM DO BANCO DE DADOS</w:t>
         </w:r>
@@ -3346,7 +3579,7 @@
             <w:noProof/>
             <w:webHidden/>
           </w:rPr>
-          <w:instrText xml:space="preserve"> PAGEREF _Toc225675262 \h </w:instrText>
+          <w:instrText xml:space="preserve"> PAGEREF _Toc225676192 \h </w:instrText>
         </w:r>
         <w:r>
           <w:rPr>
@@ -3384,14 +3617,21 @@
           <w:tab w:val="right" w:leader="dot" w:pos="9061"/>
         </w:tabs>
         <w:rPr>
+          <w:rFonts w:asciiTheme="minorHAnsi" w:eastAsiaTheme="minorEastAsia" w:hAnsiTheme="minorHAnsi" w:cstheme="minorBidi"/>
           <w:noProof/>
-        </w:rPr>
-      </w:pPr>
-      <w:hyperlink w:anchor="_Toc225675263" w:history="1">
+          <w:color w:val="auto"/>
+          <w:kern w:val="2"/>
+          <w:szCs w:val="24"/>
+          <w:lang w:val="pt-BR" w:eastAsia="pt-BR"/>
+          <w14:ligatures w14:val="standardContextual"/>
+        </w:rPr>
+      </w:pPr>
+      <w:hyperlink w:anchor="_Toc225676193" w:history="1">
         <w:r>
           <w:rPr>
             <w:rStyle w:val="Hyperlink"/>
             <w:noProof/>
+            <w:lang w:val="pt-BR"/>
           </w:rPr>
           <w:t>3.7.1 Modelo entidade relacionamento (DER)</w:t>
         </w:r>
@@ -3414,7 +3654,7 @@
             <w:noProof/>
             <w:webHidden/>
           </w:rPr>
-          <w:instrText xml:space="preserve"> PAGEREF _Toc225675263 \h </w:instrText>
+          <w:instrText xml:space="preserve"> PAGEREF _Toc225676193 \h </w:instrText>
         </w:r>
         <w:r>
           <w:rPr>
@@ -3452,14 +3692,21 @@
           <w:tab w:val="right" w:leader="dot" w:pos="9061"/>
         </w:tabs>
         <w:rPr>
+          <w:rFonts w:asciiTheme="minorHAnsi" w:eastAsiaTheme="minorEastAsia" w:hAnsiTheme="minorHAnsi" w:cstheme="minorBidi"/>
           <w:noProof/>
-        </w:rPr>
-      </w:pPr>
-      <w:hyperlink w:anchor="_Toc225675264" w:history="1">
+          <w:color w:val="auto"/>
+          <w:kern w:val="2"/>
+          <w:szCs w:val="24"/>
+          <w:lang w:val="pt-BR" w:eastAsia="pt-BR"/>
+          <w14:ligatures w14:val="standardContextual"/>
+        </w:rPr>
+      </w:pPr>
+      <w:hyperlink w:anchor="_Toc225676194" w:history="1">
         <w:r>
           <w:rPr>
             <w:rStyle w:val="Hyperlink"/>
             <w:noProof/>
+            <w:lang w:val="pt-BR"/>
           </w:rPr>
           <w:t>3.7.2 Modelo físico</w:t>
         </w:r>
@@ -3482,7 +3729,7 @@
             <w:noProof/>
             <w:webHidden/>
           </w:rPr>
-          <w:instrText xml:space="preserve"> PAGEREF _Toc225675264 \h </w:instrText>
+          <w:instrText xml:space="preserve"> PAGEREF _Toc225676194 \h </w:instrText>
         </w:r>
         <w:r>
           <w:rPr>
@@ -3520,14 +3767,21 @@
           <w:tab w:val="right" w:leader="dot" w:pos="9061"/>
         </w:tabs>
         <w:rPr>
+          <w:rFonts w:asciiTheme="minorHAnsi" w:eastAsiaTheme="minorEastAsia" w:hAnsiTheme="minorHAnsi" w:cstheme="minorBidi"/>
           <w:noProof/>
-        </w:rPr>
-      </w:pPr>
-      <w:hyperlink w:anchor="_Toc225675265" w:history="1">
+          <w:color w:val="auto"/>
+          <w:kern w:val="2"/>
+          <w:szCs w:val="24"/>
+          <w:lang w:val="pt-BR" w:eastAsia="pt-BR"/>
+          <w14:ligatures w14:val="standardContextual"/>
+        </w:rPr>
+      </w:pPr>
+      <w:hyperlink w:anchor="_Toc225676195" w:history="1">
         <w:r>
           <w:rPr>
             <w:rStyle w:val="Hyperlink"/>
             <w:noProof/>
+            <w:lang w:val="pt-BR"/>
           </w:rPr>
           <w:t>3.8 INFRAESTRUTURA DA APLICAÇÃO</w:t>
         </w:r>
@@ -3550,7 +3804,7 @@
             <w:noProof/>
             <w:webHidden/>
           </w:rPr>
-          <w:instrText xml:space="preserve"> PAGEREF _Toc225675265 \h </w:instrText>
+          <w:instrText xml:space="preserve"> PAGEREF _Toc225676195 \h </w:instrText>
         </w:r>
         <w:r>
           <w:rPr>
@@ -3588,14 +3842,21 @@
           <w:tab w:val="right" w:leader="dot" w:pos="9061"/>
         </w:tabs>
         <w:rPr>
+          <w:rFonts w:asciiTheme="minorHAnsi" w:eastAsiaTheme="minorEastAsia" w:hAnsiTheme="minorHAnsi" w:cstheme="minorBidi"/>
           <w:noProof/>
-        </w:rPr>
-      </w:pPr>
-      <w:hyperlink w:anchor="_Toc225675266" w:history="1">
+          <w:color w:val="auto"/>
+          <w:kern w:val="2"/>
+          <w:szCs w:val="24"/>
+          <w:lang w:val="pt-BR" w:eastAsia="pt-BR"/>
+          <w14:ligatures w14:val="standardContextual"/>
+        </w:rPr>
+      </w:pPr>
+      <w:hyperlink w:anchor="_Toc225676196" w:history="1">
         <w:r>
           <w:rPr>
             <w:rStyle w:val="Hyperlink"/>
             <w:noProof/>
+            <w:lang w:val="pt-BR"/>
           </w:rPr>
           <w:t>3.9 ACESSIBILIDADE</w:t>
         </w:r>
@@ -3618,7 +3879,7 @@
             <w:noProof/>
             <w:webHidden/>
           </w:rPr>
-          <w:instrText xml:space="preserve"> PAGEREF _Toc225675266 \h </w:instrText>
+          <w:instrText xml:space="preserve"> PAGEREF _Toc225676196 \h </w:instrText>
         </w:r>
         <w:r>
           <w:rPr>
@@ -3656,14 +3917,21 @@
           <w:tab w:val="right" w:leader="dot" w:pos="9061"/>
         </w:tabs>
         <w:rPr>
+          <w:rFonts w:asciiTheme="minorHAnsi" w:eastAsiaTheme="minorEastAsia" w:hAnsiTheme="minorHAnsi" w:cstheme="minorBidi"/>
           <w:noProof/>
-        </w:rPr>
-      </w:pPr>
-      <w:hyperlink w:anchor="_Toc225675267" w:history="1">
+          <w:color w:val="auto"/>
+          <w:kern w:val="2"/>
+          <w:szCs w:val="24"/>
+          <w:lang w:val="pt-BR" w:eastAsia="pt-BR"/>
+          <w14:ligatures w14:val="standardContextual"/>
+        </w:rPr>
+      </w:pPr>
+      <w:hyperlink w:anchor="_Toc225676197" w:history="1">
         <w:r>
           <w:rPr>
             <w:rStyle w:val="Hyperlink"/>
             <w:noProof/>
+            <w:lang w:val="pt-BR"/>
           </w:rPr>
           <w:t>4 EXEMPLO DA APLICAÇÃO</w:t>
         </w:r>
@@ -3686,7 +3954,7 @@
             <w:noProof/>
             <w:webHidden/>
           </w:rPr>
-          <w:instrText xml:space="preserve"> PAGEREF _Toc225675267 \h </w:instrText>
+          <w:instrText xml:space="preserve"> PAGEREF _Toc225676197 \h </w:instrText>
         </w:r>
         <w:r>
           <w:rPr>
@@ -3724,14 +3992,21 @@
           <w:tab w:val="right" w:leader="dot" w:pos="9061"/>
         </w:tabs>
         <w:rPr>
+          <w:rFonts w:asciiTheme="minorHAnsi" w:eastAsiaTheme="minorEastAsia" w:hAnsiTheme="minorHAnsi" w:cstheme="minorBidi"/>
           <w:noProof/>
-        </w:rPr>
-      </w:pPr>
-      <w:hyperlink w:anchor="_Toc225675268" w:history="1">
+          <w:color w:val="auto"/>
+          <w:kern w:val="2"/>
+          <w:szCs w:val="24"/>
+          <w:lang w:val="pt-BR" w:eastAsia="pt-BR"/>
+          <w14:ligatures w14:val="standardContextual"/>
+        </w:rPr>
+      </w:pPr>
+      <w:hyperlink w:anchor="_Toc225676198" w:history="1">
         <w:r>
           <w:rPr>
             <w:rStyle w:val="Hyperlink"/>
             <w:noProof/>
+            <w:lang w:val="pt-BR"/>
           </w:rPr>
           <w:t>5 CONSIDERAÇÕES FINAIS E SUGESTÕES DE TRABALHOS FUTUROS</w:t>
         </w:r>
@@ -3754,7 +4029,7 @@
             <w:noProof/>
             <w:webHidden/>
           </w:rPr>
-          <w:instrText xml:space="preserve"> PAGEREF _Toc225675268 \h </w:instrText>
+          <w:instrText xml:space="preserve"> PAGEREF _Toc225676198 \h </w:instrText>
         </w:r>
         <w:r>
           <w:rPr>
@@ -3792,10 +4067,16 @@
           <w:tab w:val="right" w:leader="dot" w:pos="9061"/>
         </w:tabs>
         <w:rPr>
+          <w:rFonts w:asciiTheme="minorHAnsi" w:eastAsiaTheme="minorEastAsia" w:hAnsiTheme="minorHAnsi" w:cstheme="minorBidi"/>
           <w:noProof/>
-        </w:rPr>
-      </w:pPr>
-      <w:hyperlink w:anchor="_Toc225675269" w:history="1">
+          <w:color w:val="auto"/>
+          <w:kern w:val="2"/>
+          <w:szCs w:val="24"/>
+          <w:lang w:val="pt-BR" w:eastAsia="pt-BR"/>
+          <w14:ligatures w14:val="standardContextual"/>
+        </w:rPr>
+      </w:pPr>
+      <w:hyperlink w:anchor="_Toc225676199" w:history="1">
         <w:r>
           <w:rPr>
             <w:rStyle w:val="Hyperlink"/>
@@ -3822,7 +4103,7 @@
             <w:noProof/>
             <w:webHidden/>
           </w:rPr>
-          <w:instrText xml:space="preserve"> PAGEREF _Toc225675269 \h </w:instrText>
+          <w:instrText xml:space="preserve"> PAGEREF _Toc225676199 \h </w:instrText>
         </w:r>
         <w:r>
           <w:rPr>
@@ -3860,10 +4141,16 @@
           <w:tab w:val="right" w:leader="dot" w:pos="9061"/>
         </w:tabs>
         <w:rPr>
+          <w:rFonts w:asciiTheme="minorHAnsi" w:eastAsiaTheme="minorEastAsia" w:hAnsiTheme="minorHAnsi" w:cstheme="minorBidi"/>
           <w:noProof/>
-        </w:rPr>
-      </w:pPr>
-      <w:hyperlink w:anchor="_Toc225675270" w:history="1">
+          <w:color w:val="auto"/>
+          <w:kern w:val="2"/>
+          <w:szCs w:val="24"/>
+          <w:lang w:val="pt-BR" w:eastAsia="pt-BR"/>
+          <w14:ligatures w14:val="standardContextual"/>
+        </w:rPr>
+      </w:pPr>
+      <w:hyperlink w:anchor="_Toc225676200" w:history="1">
         <w:r>
           <w:rPr>
             <w:rStyle w:val="Hyperlink"/>
@@ -3890,7 +4177,7 @@
             <w:noProof/>
             <w:webHidden/>
           </w:rPr>
-          <w:instrText xml:space="preserve"> PAGEREF _Toc225675270 \h </w:instrText>
+          <w:instrText xml:space="preserve"> PAGEREF _Toc225676200 \h </w:instrText>
         </w:r>
         <w:r>
           <w:rPr>
@@ -3928,10 +4215,16 @@
           <w:tab w:val="right" w:leader="dot" w:pos="9061"/>
         </w:tabs>
         <w:rPr>
+          <w:rFonts w:asciiTheme="minorHAnsi" w:eastAsiaTheme="minorEastAsia" w:hAnsiTheme="minorHAnsi" w:cstheme="minorBidi"/>
           <w:noProof/>
-        </w:rPr>
-      </w:pPr>
-      <w:hyperlink w:anchor="_Toc225675271" w:history="1">
+          <w:color w:val="auto"/>
+          <w:kern w:val="2"/>
+          <w:szCs w:val="24"/>
+          <w:lang w:val="pt-BR" w:eastAsia="pt-BR"/>
+          <w14:ligatures w14:val="standardContextual"/>
+        </w:rPr>
+      </w:pPr>
+      <w:hyperlink w:anchor="_Toc225676201" w:history="1">
         <w:r>
           <w:rPr>
             <w:rStyle w:val="Hyperlink"/>
@@ -3958,7 +4251,7 @@
             <w:noProof/>
             <w:webHidden/>
           </w:rPr>
-          <w:instrText xml:space="preserve"> PAGEREF _Toc225675271 \h </w:instrText>
+          <w:instrText xml:space="preserve"> PAGEREF _Toc225676201 \h </w:instrText>
         </w:r>
         <w:r>
           <w:rPr>
@@ -4012,11 +4305,12 @@
     <w:p>
       <w:pPr>
         <w:pStyle w:val="Ttulo1"/>
-        <w:rPr>
-          <w:lang w:val="pt-BR"/>
-        </w:rPr>
-      </w:pPr>
-      <w:bookmarkStart w:id="0" w:name="_Toc225675230"/>
+        <w:spacing w:before="360" w:after="360"/>
+        <w:rPr>
+          <w:lang w:val="pt-BR"/>
+        </w:rPr>
+      </w:pPr>
+      <w:bookmarkStart w:id="0" w:name="_Toc225676160"/>
       <w:r>
         <w:rPr>
           <w:rFonts w:ascii="Arial" w:eastAsia="Arial" w:hAnsi="Arial" w:cs="Arial"/>
@@ -4134,11 +4428,12 @@
     <w:p>
       <w:pPr>
         <w:pStyle w:val="Ttulo2"/>
-        <w:rPr>
-          <w:lang w:val="pt-BR"/>
-        </w:rPr>
-      </w:pPr>
-      <w:bookmarkStart w:id="1" w:name="_Toc225675231"/>
+        <w:spacing w:before="360" w:after="360"/>
+        <w:rPr>
+          <w:lang w:val="pt-BR"/>
+        </w:rPr>
+      </w:pPr>
+      <w:bookmarkStart w:id="1" w:name="_Toc225676161"/>
       <w:r>
         <w:rPr>
           <w:rFonts w:ascii="Arial" w:eastAsia="Arial" w:hAnsi="Arial" w:cs="Arial"/>
@@ -4164,11 +4459,12 @@
     <w:p>
       <w:pPr>
         <w:pStyle w:val="Ttulo3"/>
-        <w:rPr>
-          <w:lang w:val="pt-BR"/>
-        </w:rPr>
-      </w:pPr>
-      <w:bookmarkStart w:id="2" w:name="_Toc225675232"/>
+        <w:spacing w:before="360" w:after="360"/>
+        <w:rPr>
+          <w:lang w:val="pt-BR"/>
+        </w:rPr>
+      </w:pPr>
+      <w:bookmarkStart w:id="2" w:name="_Toc225676162"/>
       <w:r>
         <w:rPr>
           <w:rFonts w:ascii="Arial" w:eastAsia="Arial" w:hAnsi="Arial" w:cs="Arial"/>
@@ -4194,11 +4490,12 @@
     <w:p>
       <w:pPr>
         <w:pStyle w:val="Ttulo3"/>
-        <w:rPr>
-          <w:lang w:val="pt-BR"/>
-        </w:rPr>
-      </w:pPr>
-      <w:bookmarkStart w:id="3" w:name="_Toc225675233"/>
+        <w:spacing w:before="360" w:after="360"/>
+        <w:rPr>
+          <w:lang w:val="pt-BR"/>
+        </w:rPr>
+      </w:pPr>
+      <w:bookmarkStart w:id="3" w:name="_Toc225676163"/>
       <w:r>
         <w:rPr>
           <w:rFonts w:ascii="Arial" w:eastAsia="Arial" w:hAnsi="Arial" w:cs="Arial"/>
@@ -4331,11 +4628,12 @@
     <w:p>
       <w:pPr>
         <w:pStyle w:val="Ttulo2"/>
-        <w:rPr>
-          <w:lang w:val="pt-BR"/>
-        </w:rPr>
-      </w:pPr>
-      <w:bookmarkStart w:id="4" w:name="_Toc225675234"/>
+        <w:spacing w:before="360" w:after="360"/>
+        <w:rPr>
+          <w:lang w:val="pt-BR"/>
+        </w:rPr>
+      </w:pPr>
+      <w:bookmarkStart w:id="4" w:name="_Toc225676164"/>
       <w:r>
         <w:rPr>
           <w:rFonts w:ascii="Arial" w:eastAsia="Arial" w:hAnsi="Arial" w:cs="Arial"/>
@@ -4601,11 +4899,12 @@
     <w:p>
       <w:pPr>
         <w:pStyle w:val="Ttulo2"/>
-        <w:rPr>
-          <w:lang w:val="pt-BR"/>
-        </w:rPr>
-      </w:pPr>
-      <w:bookmarkStart w:id="5" w:name="_Toc225675235"/>
+        <w:spacing w:before="360" w:after="360"/>
+        <w:rPr>
+          <w:lang w:val="pt-BR"/>
+        </w:rPr>
+      </w:pPr>
+      <w:bookmarkStart w:id="5" w:name="_Toc225676165"/>
       <w:r>
         <w:rPr>
           <w:rFonts w:ascii="Arial" w:eastAsia="Arial" w:hAnsi="Arial" w:cs="Arial"/>
@@ -4707,11 +5006,12 @@
     <w:p>
       <w:pPr>
         <w:pStyle w:val="Ttulo3"/>
-        <w:rPr>
-          <w:lang w:val="pt-BR"/>
-        </w:rPr>
-      </w:pPr>
-      <w:bookmarkStart w:id="6" w:name="_Toc225675236"/>
+        <w:spacing w:before="360" w:after="360"/>
+        <w:rPr>
+          <w:lang w:val="pt-BR"/>
+        </w:rPr>
+      </w:pPr>
+      <w:bookmarkStart w:id="6" w:name="_Toc225676166"/>
       <w:r>
         <w:rPr>
           <w:rFonts w:ascii="Arial" w:eastAsia="Arial" w:hAnsi="Arial" w:cs="Arial"/>
@@ -4783,11 +5083,12 @@
     <w:p>
       <w:pPr>
         <w:pStyle w:val="Ttulo2"/>
-        <w:rPr>
-          <w:lang w:val="pt-BR"/>
-        </w:rPr>
-      </w:pPr>
-      <w:bookmarkStart w:id="7" w:name="_Toc225675237"/>
+        <w:spacing w:before="360" w:after="360"/>
+        <w:rPr>
+          <w:lang w:val="pt-BR"/>
+        </w:rPr>
+      </w:pPr>
+      <w:bookmarkStart w:id="7" w:name="_Toc225676167"/>
       <w:r>
         <w:rPr>
           <w:rFonts w:ascii="Arial" w:eastAsia="Arial" w:hAnsi="Arial" w:cs="Arial"/>
@@ -4813,11 +5114,12 @@
     <w:p>
       <w:pPr>
         <w:pStyle w:val="Ttulo3"/>
-        <w:rPr>
-          <w:lang w:val="pt-BR"/>
-        </w:rPr>
-      </w:pPr>
-      <w:bookmarkStart w:id="8" w:name="_Toc225675238"/>
+        <w:spacing w:before="360" w:after="360"/>
+        <w:rPr>
+          <w:lang w:val="pt-BR"/>
+        </w:rPr>
+      </w:pPr>
+      <w:bookmarkStart w:id="8" w:name="_Toc225676168"/>
       <w:r>
         <w:rPr>
           <w:rFonts w:ascii="Arial" w:eastAsia="Arial" w:hAnsi="Arial" w:cs="Arial"/>
@@ -4843,11 +5145,12 @@
     <w:p>
       <w:pPr>
         <w:pStyle w:val="Ttulo3"/>
-        <w:rPr>
-          <w:lang w:val="pt-BR"/>
-        </w:rPr>
-      </w:pPr>
-      <w:bookmarkStart w:id="9" w:name="_Toc225675239"/>
+        <w:spacing w:before="360" w:after="360"/>
+        <w:rPr>
+          <w:lang w:val="pt-BR"/>
+        </w:rPr>
+      </w:pPr>
+      <w:bookmarkStart w:id="9" w:name="_Toc225676169"/>
       <w:r>
         <w:rPr>
           <w:rFonts w:ascii="Arial" w:eastAsia="Arial" w:hAnsi="Arial" w:cs="Arial"/>
@@ -4971,11 +5274,12 @@
     <w:p>
       <w:pPr>
         <w:pStyle w:val="Ttulo3"/>
-        <w:rPr>
-          <w:lang w:val="pt-BR"/>
-        </w:rPr>
-      </w:pPr>
-      <w:bookmarkStart w:id="10" w:name="_Toc225675240"/>
+        <w:spacing w:before="360" w:after="360"/>
+        <w:rPr>
+          <w:lang w:val="pt-BR"/>
+        </w:rPr>
+      </w:pPr>
+      <w:bookmarkStart w:id="10" w:name="_Toc225676170"/>
       <w:r>
         <w:rPr>
           <w:rFonts w:ascii="Arial" w:eastAsia="Arial" w:hAnsi="Arial" w:cs="Arial"/>
@@ -5198,11 +5502,12 @@
     <w:p>
       <w:pPr>
         <w:pStyle w:val="Ttulo3"/>
-        <w:rPr>
-          <w:lang w:val="pt-BR"/>
-        </w:rPr>
-      </w:pPr>
-      <w:bookmarkStart w:id="11" w:name="_Toc225675241"/>
+        <w:spacing w:before="360" w:after="360"/>
+        <w:rPr>
+          <w:lang w:val="pt-BR"/>
+        </w:rPr>
+      </w:pPr>
+      <w:bookmarkStart w:id="11" w:name="_Toc225676171"/>
       <w:r>
         <w:rPr>
           <w:rFonts w:ascii="Arial" w:eastAsia="Arial" w:hAnsi="Arial" w:cs="Arial"/>
@@ -5864,11 +6169,12 @@
     <w:p>
       <w:pPr>
         <w:pStyle w:val="Ttulo3"/>
-        <w:rPr>
-          <w:lang w:val="pt-BR"/>
-        </w:rPr>
-      </w:pPr>
-      <w:bookmarkStart w:id="12" w:name="_Toc225675242"/>
+        <w:spacing w:before="360" w:after="360"/>
+        <w:rPr>
+          <w:lang w:val="pt-BR"/>
+        </w:rPr>
+      </w:pPr>
+      <w:bookmarkStart w:id="12" w:name="_Toc225676172"/>
       <w:r>
         <w:rPr>
           <w:rFonts w:ascii="Arial" w:eastAsia="Arial" w:hAnsi="Arial" w:cs="Arial"/>
@@ -5940,11 +6246,12 @@
     <w:p>
       <w:pPr>
         <w:pStyle w:val="Ttulo2"/>
-        <w:rPr>
-          <w:lang w:val="pt-BR"/>
-        </w:rPr>
-      </w:pPr>
-      <w:bookmarkStart w:id="13" w:name="_Toc225675243"/>
+        <w:spacing w:before="360" w:after="360"/>
+        <w:rPr>
+          <w:lang w:val="pt-BR"/>
+        </w:rPr>
+      </w:pPr>
+      <w:bookmarkStart w:id="13" w:name="_Toc225676173"/>
       <w:r>
         <w:rPr>
           <w:rFonts w:ascii="Arial" w:eastAsia="Arial" w:hAnsi="Arial" w:cs="Arial"/>
@@ -6046,11 +6353,12 @@
     <w:p>
       <w:pPr>
         <w:pStyle w:val="Ttulo2"/>
-        <w:rPr>
-          <w:lang w:val="pt-BR"/>
-        </w:rPr>
-      </w:pPr>
-      <w:bookmarkStart w:id="14" w:name="_Toc225675244"/>
+        <w:spacing w:before="360" w:after="360"/>
+        <w:rPr>
+          <w:lang w:val="pt-BR"/>
+        </w:rPr>
+      </w:pPr>
+      <w:bookmarkStart w:id="14" w:name="_Toc225676174"/>
       <w:r>
         <w:rPr>
           <w:rFonts w:ascii="Arial" w:eastAsia="Arial" w:hAnsi="Arial" w:cs="Arial"/>
@@ -6704,11 +7012,12 @@
     <w:p>
       <w:pPr>
         <w:pStyle w:val="Ttulo2"/>
-        <w:rPr>
-          <w:lang w:val="pt-BR"/>
-        </w:rPr>
-      </w:pPr>
-      <w:bookmarkStart w:id="15" w:name="_Toc225675245"/>
+        <w:spacing w:before="360" w:after="360"/>
+        <w:rPr>
+          <w:lang w:val="pt-BR"/>
+        </w:rPr>
+      </w:pPr>
+      <w:bookmarkStart w:id="15" w:name="_Toc225676175"/>
       <w:r>
         <w:rPr>
           <w:rFonts w:ascii="Arial" w:eastAsia="Arial" w:hAnsi="Arial" w:cs="Arial"/>
@@ -8121,12 +8430,12 @@
     <w:p>
       <w:pPr>
         <w:pStyle w:val="Ttulo1"/>
-        <w:spacing w:before="240" w:after="120"/>
-        <w:rPr>
-          <w:lang w:val="pt-BR"/>
-        </w:rPr>
-      </w:pPr>
-      <w:bookmarkStart w:id="16" w:name="_Toc225675246"/>
+        <w:spacing w:before="360" w:after="360"/>
+        <w:rPr>
+          <w:lang w:val="pt-BR"/>
+        </w:rPr>
+      </w:pPr>
+      <w:bookmarkStart w:id="16" w:name="_Toc225676176"/>
       <w:r>
         <w:rPr>
           <w:rFonts w:ascii="Arial" w:hAnsi="Arial"/>
@@ -8169,12 +8478,12 @@
     <w:p>
       <w:pPr>
         <w:pStyle w:val="Ttulo2"/>
-        <w:spacing w:before="240" w:after="120"/>
-        <w:rPr>
-          <w:lang w:val="pt-BR"/>
-        </w:rPr>
-      </w:pPr>
-      <w:bookmarkStart w:id="17" w:name="_Toc225675247"/>
+        <w:spacing w:before="360" w:after="360"/>
+        <w:rPr>
+          <w:lang w:val="pt-BR"/>
+        </w:rPr>
+      </w:pPr>
+      <w:bookmarkStart w:id="17" w:name="_Toc225676177"/>
       <w:r>
         <w:rPr>
           <w:rFonts w:ascii="Arial" w:hAnsi="Arial"/>
@@ -8221,6 +8530,7 @@
           <w:szCs w:val="24"/>
           <w:lang w:val="pt-BR"/>
         </w:rPr>
+        <w:lastRenderedPageBreak/>
         <w:t xml:space="preserve">As consequências dessa lacuna tecnológica são amplamente documentadas na literatura. Slack, Brandon-Jones e Johnston (2022, p. 298) destacaram que a gestão ineficiente de recursos compartilhados gera conflitos de agendamento, situação em que dois ou mais eventos são alocados para o mesmo espaço no mesmo horário -, subutilização de ambientes disponíveis e desperdício de tempo administrativo para resolução de sobreposições. O fenômeno do </w:t>
       </w:r>
       <w:r>
@@ -8318,12 +8628,12 @@
     <w:p>
       <w:pPr>
         <w:pStyle w:val="Ttulo2"/>
-        <w:spacing w:before="240" w:after="120"/>
-        <w:rPr>
-          <w:lang w:val="pt-BR"/>
-        </w:rPr>
-      </w:pPr>
-      <w:bookmarkStart w:id="18" w:name="_Toc225675248"/>
+        <w:spacing w:before="360" w:after="360"/>
+        <w:rPr>
+          <w:lang w:val="pt-BR"/>
+        </w:rPr>
+      </w:pPr>
+      <w:bookmarkStart w:id="18" w:name="_Toc225676178"/>
       <w:r>
         <w:rPr>
           <w:rFonts w:ascii="Arial" w:hAnsi="Arial"/>
@@ -8499,12 +8809,12 @@
     <w:p>
       <w:pPr>
         <w:pStyle w:val="Ttulo2"/>
-        <w:spacing w:before="240" w:after="120"/>
-        <w:rPr>
-          <w:lang w:val="pt-BR"/>
-        </w:rPr>
-      </w:pPr>
-      <w:bookmarkStart w:id="19" w:name="_Toc225675249"/>
+        <w:spacing w:before="360" w:after="360"/>
+        <w:rPr>
+          <w:lang w:val="pt-BR"/>
+        </w:rPr>
+      </w:pPr>
+      <w:bookmarkStart w:id="19" w:name="_Toc225676179"/>
       <w:r>
         <w:rPr>
           <w:rFonts w:ascii="Arial" w:hAnsi="Arial"/>
@@ -8664,12 +8974,12 @@
     <w:p>
       <w:pPr>
         <w:pStyle w:val="Ttulo2"/>
-        <w:spacing w:before="240" w:after="120"/>
-        <w:rPr>
-          <w:lang w:val="pt-BR"/>
-        </w:rPr>
-      </w:pPr>
-      <w:bookmarkStart w:id="20" w:name="_Toc225675250"/>
+        <w:spacing w:before="360" w:after="360"/>
+        <w:rPr>
+          <w:lang w:val="pt-BR"/>
+        </w:rPr>
+      </w:pPr>
+      <w:bookmarkStart w:id="20" w:name="_Toc225676180"/>
       <w:r>
         <w:rPr>
           <w:rFonts w:ascii="Arial" w:hAnsi="Arial"/>
@@ -8859,12 +9169,12 @@
     <w:p>
       <w:pPr>
         <w:pStyle w:val="Ttulo2"/>
-        <w:spacing w:before="240" w:after="120"/>
-        <w:rPr>
-          <w:lang w:val="pt-BR"/>
-        </w:rPr>
-      </w:pPr>
-      <w:bookmarkStart w:id="21" w:name="_Toc225675251"/>
+        <w:spacing w:before="360" w:after="360"/>
+        <w:rPr>
+          <w:lang w:val="pt-BR"/>
+        </w:rPr>
+      </w:pPr>
+      <w:bookmarkStart w:id="21" w:name="_Toc225676181"/>
       <w:r>
         <w:rPr>
           <w:rFonts w:ascii="Arial" w:hAnsi="Arial"/>
@@ -9271,6 +9581,7 @@
           <w:szCs w:val="24"/>
           <w:lang w:val="pt-BR"/>
         </w:rPr>
+        <w:lastRenderedPageBreak/>
         <w:t>consistência visual e facilita a criação de interfaces responsivas, requisito relevante para um sistema acessado tanto em desktops quanto em dispositivos móveis.</w:t>
       </w:r>
     </w:p>
@@ -9440,11 +9751,12 @@
     <w:p>
       <w:pPr>
         <w:pStyle w:val="Ttulo1"/>
-        <w:rPr>
-          <w:lang w:val="pt-BR"/>
-        </w:rPr>
-      </w:pPr>
-      <w:bookmarkStart w:id="22" w:name="_Toc225675252"/>
+        <w:spacing w:before="360" w:after="360"/>
+        <w:rPr>
+          <w:lang w:val="pt-BR"/>
+        </w:rPr>
+      </w:pPr>
+      <w:bookmarkStart w:id="22" w:name="_Toc225676182"/>
       <w:r>
         <w:rPr>
           <w:rFonts w:ascii="Arial" w:eastAsia="Arial" w:hAnsi="Arial" w:cs="Arial"/>
@@ -9465,11 +9777,12 @@
     <w:p>
       <w:pPr>
         <w:pStyle w:val="Ttulo2"/>
-        <w:rPr>
-          <w:lang w:val="pt-BR"/>
-        </w:rPr>
-      </w:pPr>
-      <w:bookmarkStart w:id="23" w:name="_Toc225675253"/>
+        <w:spacing w:before="360" w:after="360"/>
+        <w:rPr>
+          <w:lang w:val="pt-BR"/>
+        </w:rPr>
+      </w:pPr>
+      <w:bookmarkStart w:id="23" w:name="_Toc225676183"/>
       <w:r>
         <w:rPr>
           <w:rFonts w:ascii="Arial" w:eastAsia="Arial" w:hAnsi="Arial" w:cs="Arial"/>
@@ -9490,11 +9803,12 @@
     <w:p>
       <w:pPr>
         <w:pStyle w:val="Ttulo2"/>
-        <w:rPr>
-          <w:lang w:val="pt-BR"/>
-        </w:rPr>
-      </w:pPr>
-      <w:bookmarkStart w:id="24" w:name="_Toc225675254"/>
+        <w:spacing w:before="360" w:after="360"/>
+        <w:rPr>
+          <w:lang w:val="pt-BR"/>
+        </w:rPr>
+      </w:pPr>
+      <w:bookmarkStart w:id="24" w:name="_Toc225676184"/>
       <w:r>
         <w:rPr>
           <w:rFonts w:ascii="Arial" w:eastAsia="Arial" w:hAnsi="Arial" w:cs="Arial"/>
@@ -9515,11 +9829,12 @@
     <w:p>
       <w:pPr>
         <w:pStyle w:val="Ttulo3"/>
-        <w:rPr>
-          <w:lang w:val="pt-BR"/>
-        </w:rPr>
-      </w:pPr>
-      <w:bookmarkStart w:id="25" w:name="_Toc225675255"/>
+        <w:spacing w:before="360" w:after="360"/>
+        <w:rPr>
+          <w:lang w:val="pt-BR"/>
+        </w:rPr>
+      </w:pPr>
+      <w:bookmarkStart w:id="25" w:name="_Toc225676185"/>
       <w:r>
         <w:rPr>
           <w:rFonts w:ascii="Arial" w:eastAsia="Arial" w:hAnsi="Arial" w:cs="Arial"/>
@@ -9540,11 +9855,12 @@
     <w:p>
       <w:pPr>
         <w:pStyle w:val="Ttulo3"/>
-        <w:rPr>
-          <w:lang w:val="pt-BR"/>
-        </w:rPr>
-      </w:pPr>
-      <w:bookmarkStart w:id="26" w:name="_Toc225675256"/>
+        <w:spacing w:before="360" w:after="360"/>
+        <w:rPr>
+          <w:lang w:val="pt-BR"/>
+        </w:rPr>
+      </w:pPr>
+      <w:bookmarkStart w:id="26" w:name="_Toc225676186"/>
       <w:r>
         <w:rPr>
           <w:rFonts w:ascii="Arial" w:eastAsia="Arial" w:hAnsi="Arial" w:cs="Arial"/>
@@ -9566,11 +9882,12 @@
     <w:p>
       <w:pPr>
         <w:pStyle w:val="Ttulo2"/>
-        <w:rPr>
-          <w:lang w:val="pt-BR"/>
-        </w:rPr>
-      </w:pPr>
-      <w:bookmarkStart w:id="27" w:name="_Toc225675257"/>
+        <w:spacing w:before="360" w:after="360"/>
+        <w:rPr>
+          <w:lang w:val="pt-BR"/>
+        </w:rPr>
+      </w:pPr>
+      <w:bookmarkStart w:id="27" w:name="_Toc225676187"/>
       <w:r>
         <w:rPr>
           <w:rFonts w:ascii="Arial" w:eastAsia="Arial" w:hAnsi="Arial" w:cs="Arial"/>
@@ -9591,11 +9908,12 @@
     <w:p>
       <w:pPr>
         <w:pStyle w:val="Ttulo3"/>
-        <w:rPr>
-          <w:lang w:val="pt-BR"/>
-        </w:rPr>
-      </w:pPr>
-      <w:bookmarkStart w:id="28" w:name="_Toc225675258"/>
+        <w:spacing w:before="360" w:after="360"/>
+        <w:rPr>
+          <w:lang w:val="pt-BR"/>
+        </w:rPr>
+      </w:pPr>
+      <w:bookmarkStart w:id="28" w:name="_Toc225676188"/>
       <w:r>
         <w:rPr>
           <w:rFonts w:ascii="Arial" w:eastAsia="Arial" w:hAnsi="Arial" w:cs="Arial"/>
@@ -9616,11 +9934,12 @@
     <w:p>
       <w:pPr>
         <w:pStyle w:val="Ttulo2"/>
-        <w:rPr>
-          <w:lang w:val="pt-BR"/>
-        </w:rPr>
-      </w:pPr>
-      <w:bookmarkStart w:id="29" w:name="_Toc225675259"/>
+        <w:spacing w:before="360" w:after="360"/>
+        <w:rPr>
+          <w:lang w:val="pt-BR"/>
+        </w:rPr>
+      </w:pPr>
+      <w:bookmarkStart w:id="29" w:name="_Toc225676189"/>
       <w:r>
         <w:rPr>
           <w:rFonts w:ascii="Arial" w:eastAsia="Arial" w:hAnsi="Arial" w:cs="Arial"/>
@@ -9641,11 +9960,12 @@
     <w:p>
       <w:pPr>
         <w:pStyle w:val="Ttulo2"/>
-        <w:rPr>
-          <w:lang w:val="pt-BR"/>
-        </w:rPr>
-      </w:pPr>
-      <w:bookmarkStart w:id="30" w:name="_Toc225675260"/>
+        <w:spacing w:before="360" w:after="360"/>
+        <w:rPr>
+          <w:lang w:val="pt-BR"/>
+        </w:rPr>
+      </w:pPr>
+      <w:bookmarkStart w:id="30" w:name="_Toc225676190"/>
       <w:r>
         <w:rPr>
           <w:rFonts w:ascii="Arial" w:eastAsia="Arial" w:hAnsi="Arial" w:cs="Arial"/>
@@ -9666,11 +9986,12 @@
     <w:p>
       <w:pPr>
         <w:pStyle w:val="Ttulo2"/>
-        <w:rPr>
-          <w:lang w:val="pt-BR"/>
-        </w:rPr>
-      </w:pPr>
-      <w:bookmarkStart w:id="31" w:name="_Toc225675261"/>
+        <w:spacing w:before="360" w:after="360"/>
+        <w:rPr>
+          <w:lang w:val="pt-BR"/>
+        </w:rPr>
+      </w:pPr>
+      <w:bookmarkStart w:id="31" w:name="_Toc225676191"/>
       <w:r>
         <w:rPr>
           <w:rFonts w:ascii="Arial" w:eastAsia="Arial" w:hAnsi="Arial" w:cs="Arial"/>
@@ -9706,11 +10027,12 @@
     <w:p>
       <w:pPr>
         <w:pStyle w:val="Ttulo2"/>
-        <w:rPr>
-          <w:lang w:val="pt-BR"/>
-        </w:rPr>
-      </w:pPr>
-      <w:bookmarkStart w:id="32" w:name="_Toc225675262"/>
+        <w:spacing w:before="360" w:after="360"/>
+        <w:rPr>
+          <w:lang w:val="pt-BR"/>
+        </w:rPr>
+      </w:pPr>
+      <w:bookmarkStart w:id="32" w:name="_Toc225676192"/>
       <w:r>
         <w:rPr>
           <w:rFonts w:ascii="Arial" w:eastAsia="Arial" w:hAnsi="Arial" w:cs="Arial"/>
@@ -9731,11 +10053,12 @@
     <w:p>
       <w:pPr>
         <w:pStyle w:val="Ttulo3"/>
-        <w:rPr>
-          <w:lang w:val="pt-BR"/>
-        </w:rPr>
-      </w:pPr>
-      <w:bookmarkStart w:id="33" w:name="_Toc225675263"/>
+        <w:spacing w:before="360" w:after="360"/>
+        <w:rPr>
+          <w:lang w:val="pt-BR"/>
+        </w:rPr>
+      </w:pPr>
+      <w:bookmarkStart w:id="33" w:name="_Toc225676193"/>
       <w:r>
         <w:rPr>
           <w:rFonts w:ascii="Arial" w:eastAsia="Arial" w:hAnsi="Arial" w:cs="Arial"/>
@@ -9756,11 +10079,12 @@
     <w:p>
       <w:pPr>
         <w:pStyle w:val="Ttulo3"/>
-        <w:rPr>
-          <w:lang w:val="pt-BR"/>
-        </w:rPr>
-      </w:pPr>
-      <w:bookmarkStart w:id="34" w:name="_Toc225675264"/>
+        <w:spacing w:before="360" w:after="360"/>
+        <w:rPr>
+          <w:lang w:val="pt-BR"/>
+        </w:rPr>
+      </w:pPr>
+      <w:bookmarkStart w:id="34" w:name="_Toc225676194"/>
       <w:r>
         <w:rPr>
           <w:rFonts w:ascii="Arial" w:eastAsia="Arial" w:hAnsi="Arial" w:cs="Arial"/>
@@ -9781,11 +10105,12 @@
     <w:p>
       <w:pPr>
         <w:pStyle w:val="Ttulo2"/>
-        <w:rPr>
-          <w:lang w:val="pt-BR"/>
-        </w:rPr>
-      </w:pPr>
-      <w:bookmarkStart w:id="35" w:name="_Toc225675265"/>
+        <w:spacing w:before="360" w:after="360"/>
+        <w:rPr>
+          <w:lang w:val="pt-BR"/>
+        </w:rPr>
+      </w:pPr>
+      <w:bookmarkStart w:id="35" w:name="_Toc225676195"/>
       <w:r>
         <w:rPr>
           <w:rFonts w:ascii="Arial" w:eastAsia="Arial" w:hAnsi="Arial" w:cs="Arial"/>
@@ -9807,11 +10132,12 @@
     <w:p>
       <w:pPr>
         <w:pStyle w:val="Ttulo2"/>
-        <w:rPr>
-          <w:lang w:val="pt-BR"/>
-        </w:rPr>
-      </w:pPr>
-      <w:bookmarkStart w:id="36" w:name="_Toc225675266"/>
+        <w:spacing w:before="360" w:after="360"/>
+        <w:rPr>
+          <w:lang w:val="pt-BR"/>
+        </w:rPr>
+      </w:pPr>
+      <w:bookmarkStart w:id="36" w:name="_Toc225676196"/>
       <w:r>
         <w:rPr>
           <w:rFonts w:ascii="Arial" w:eastAsia="Arial" w:hAnsi="Arial" w:cs="Arial"/>
@@ -9845,11 +10171,12 @@
     <w:p>
       <w:pPr>
         <w:pStyle w:val="Ttulo1"/>
-        <w:rPr>
-          <w:lang w:val="pt-BR"/>
-        </w:rPr>
-      </w:pPr>
-      <w:bookmarkStart w:id="37" w:name="_Toc225675267"/>
+        <w:spacing w:before="360" w:after="360"/>
+        <w:rPr>
+          <w:lang w:val="pt-BR"/>
+        </w:rPr>
+      </w:pPr>
+      <w:bookmarkStart w:id="37" w:name="_Toc225676197"/>
       <w:r>
         <w:rPr>
           <w:rFonts w:ascii="Arial" w:eastAsia="Arial" w:hAnsi="Arial" w:cs="Arial"/>
@@ -9884,11 +10211,12 @@
     <w:p>
       <w:pPr>
         <w:pStyle w:val="Ttulo1"/>
-        <w:rPr>
-          <w:lang w:val="pt-BR"/>
-        </w:rPr>
-      </w:pPr>
-      <w:bookmarkStart w:id="38" w:name="_Toc225675268"/>
+        <w:spacing w:before="360" w:after="360"/>
+        <w:rPr>
+          <w:lang w:val="pt-BR"/>
+        </w:rPr>
+      </w:pPr>
+      <w:bookmarkStart w:id="38" w:name="_Toc225676198"/>
       <w:r>
         <w:rPr>
           <w:rFonts w:ascii="Arial" w:eastAsia="Arial" w:hAnsi="Arial" w:cs="Arial"/>
@@ -9924,7 +10252,7 @@
       <w:pPr>
         <w:pStyle w:val="TituloCentro"/>
       </w:pPr>
-      <w:bookmarkStart w:id="39" w:name="_Toc225675269"/>
+      <w:bookmarkStart w:id="39" w:name="_Toc225676199"/>
       <w:r>
         <w:rPr>
           <w:rFonts w:eastAsia="Arial" w:cs="Arial"/>
@@ -11047,7 +11375,7 @@
       <w:pPr>
         <w:pStyle w:val="TituloCentro"/>
       </w:pPr>
-      <w:bookmarkStart w:id="40" w:name="_Toc225675270"/>
+      <w:bookmarkStart w:id="40" w:name="_Toc225676200"/>
       <w:r>
         <w:rPr>
           <w:rFonts w:eastAsia="Arial" w:cs="Arial"/>
@@ -11070,7 +11398,7 @@
       <w:pPr>
         <w:pStyle w:val="TituloCentro"/>
       </w:pPr>
-      <w:bookmarkStart w:id="41" w:name="_Toc225675271"/>
+      <w:bookmarkStart w:id="41" w:name="_Toc225676201"/>
       <w:r>
         <w:rPr>
           <w:rFonts w:eastAsia="Arial" w:cs="Arial"/>

</xml_diff>